<commit_message>
Adaugare pasi experti + modificare template
</commit_message>
<xml_diff>
--- a/RPGenServer/templates/template.docx
+++ b/RPGenServer/templates/template.docx
@@ -687,8 +687,6 @@
               </w:rPr>
               <w:t>{{title}}</w:t>
             </w:r>
-            <w:bookmarkStart w:id="1" w:name="_GoBack"/>
-            <w:bookmarkEnd w:id="1"/>
           </w:p>
         </w:tc>
         <w:tc>
@@ -949,17 +947,59 @@
         <w:jc w:val="both"/>
         <w:rPr>
           <w:rFonts w:ascii="Trebuchet MS" w:hAnsi="Trebuchet MS"/>
-        </w:rPr>
-      </w:pPr>
-      <w:r>
-        <w:rPr>
-          <w:rFonts w:ascii="Trebuchet MS" w:hAnsi="Trebuchet MS"/>
           <w:i/>
         </w:rPr>
+      </w:pPr>
+      <w:r>
+        <w:rPr>
+          <w:rFonts w:ascii="Trebuchet MS" w:hAnsi="Trebuchet MS"/>
+          <w:i/>
+        </w:rPr>
         <w:t xml:space="preserve">Expertul va detalia motivele care au dus la întârzieri în execuția sarcinilor alocate, dacă acestea sunt de natură a periclita implementarea activităților proiectului precum și măsurile luate pentru soluționarea acestora și preîntâmpinarea altor asemenea situații. </w:t>
       </w:r>
     </w:p>
-    <w:p/>
+    <w:p>
+      <w:pPr>
+        <w:spacing w:before="120" w:after="120"/>
+        <w:ind w:left="284"/>
+        <w:jc w:val="both"/>
+        <w:rPr>
+          <w:rFonts w:ascii="Trebuchet MS" w:hAnsi="Trebuchet MS"/>
+          <w:i/>
+        </w:rPr>
+      </w:pPr>
+    </w:p>
+    <w:p>
+      <w:pPr>
+        <w:rPr>
+          <w:rFonts w:hint="default"/>
+          <w:b/>
+          <w:bCs/>
+          <w:lang w:val="en-US"/>
+        </w:rPr>
+      </w:pPr>
+      <w:r>
+        <w:rPr>
+          <w:rFonts w:hint="default"/>
+          <w:b/>
+          <w:bCs/>
+          <w:lang w:val="en-US"/>
+        </w:rPr>
+        <w:t>Nu este cazul</w:t>
+      </w:r>
+    </w:p>
+    <w:p>
+      <w:pPr>
+        <w:rPr>
+          <w:rFonts w:hint="default"/>
+          <w:b/>
+          <w:bCs/>
+          <w:lang w:val="en-US"/>
+        </w:rPr>
+      </w:pPr>
+      <w:bookmarkStart w:id="1" w:name="_GoBack"/>
+      <w:bookmarkEnd w:id="1"/>
+    </w:p>
     <w:p>
       <w:pPr>
         <w:rPr>

</xml_diff>